<commit_message>
chore: checkpoint before TypeScript 7 migration
</commit_message>
<xml_diff>
--- a/backend/exports/BionicHand_System.docx
+++ b/backend/exports/BionicHand_System.docx
@@ -55,7 +55,7 @@
           <w:b/>
           <w:sz w:val="24"/>
         </w:rPr>
-        <w:t>Generation Timestamp:  2026-06-30  08:29 UTC</w:t>
+        <w:t>Generation Timestamp:  2026-07-12  16:07 UTC</w:t>
       </w:r>
     </w:p>
     <w:p>
@@ -4988,7 +4988,82 @@
                 <w:rFonts w:ascii="Times New Roman" w:hAnsi="Times New Roman"/>
                 <w:sz w:val="20"/>
               </w:rPr>
-              <w:t>Research Agent</w:t>
+              <w:t>KnowledgeGraphAgent</w:t>
+            </w:r>
+          </w:p>
+        </w:tc>
+        <w:tc>
+          <w:tcPr>
+            <w:tcW w:type="dxa" w:w="1805"/>
+          </w:tcPr>
+          <w:p>
+            <w:r/>
+            <w:r>
+              <w:rPr>
+                <w:rFonts w:ascii="Times New Roman" w:hAnsi="Times New Roman"/>
+                <w:sz w:val="20"/>
+              </w:rPr>
+            </w:r>
+          </w:p>
+        </w:tc>
+        <w:tc>
+          <w:tcPr>
+            <w:tcW w:type="dxa" w:w="1805"/>
+          </w:tcPr>
+          <w:p>
+            <w:r/>
+            <w:r>
+              <w:rPr>
+                <w:rFonts w:ascii="Times New Roman" w:hAnsi="Times New Roman"/>
+                <w:sz w:val="20"/>
+              </w:rPr>
+            </w:r>
+          </w:p>
+        </w:tc>
+        <w:tc>
+          <w:tcPr>
+            <w:tcW w:type="dxa" w:w="1805"/>
+          </w:tcPr>
+          <w:p>
+            <w:r/>
+            <w:r>
+              <w:rPr>
+                <w:rFonts w:ascii="Times New Roman" w:hAnsi="Times New Roman"/>
+                <w:sz w:val="20"/>
+              </w:rPr>
+              <w:t>SUCCESS</w:t>
+            </w:r>
+          </w:p>
+        </w:tc>
+        <w:tc>
+          <w:tcPr>
+            <w:tcW w:type="dxa" w:w="1805"/>
+          </w:tcPr>
+          <w:p>
+            <w:r/>
+            <w:r>
+              <w:rPr>
+                <w:rFonts w:ascii="Times New Roman" w:hAnsi="Times New Roman"/>
+                <w:sz w:val="20"/>
+              </w:rPr>
+              <w:t>—</w:t>
+            </w:r>
+          </w:p>
+        </w:tc>
+      </w:tr>
+      <w:tr>
+        <w:tc>
+          <w:tcPr>
+            <w:tcW w:type="dxa" w:w="1805"/>
+          </w:tcPr>
+          <w:p>
+            <w:r/>
+            <w:r>
+              <w:rPr>
+                <w:rFonts w:ascii="Times New Roman" w:hAnsi="Times New Roman"/>
+                <w:sz w:val="20"/>
+              </w:rPr>
+              <w:t>KnowledgeGraphAgent</w:t>
             </w:r>
           </w:p>
         </w:tc>
@@ -5064,81 +5139,6 @@
                 <w:sz w:val="20"/>
               </w:rPr>
               <w:t>Research Agent</w:t>
-            </w:r>
-          </w:p>
-        </w:tc>
-        <w:tc>
-          <w:tcPr>
-            <w:tcW w:type="dxa" w:w="1805"/>
-          </w:tcPr>
-          <w:p>
-            <w:r/>
-            <w:r>
-              <w:rPr>
-                <w:rFonts w:ascii="Times New Roman" w:hAnsi="Times New Roman"/>
-                <w:sz w:val="20"/>
-              </w:rPr>
-            </w:r>
-          </w:p>
-        </w:tc>
-        <w:tc>
-          <w:tcPr>
-            <w:tcW w:type="dxa" w:w="1805"/>
-          </w:tcPr>
-          <w:p>
-            <w:r/>
-            <w:r>
-              <w:rPr>
-                <w:rFonts w:ascii="Times New Roman" w:hAnsi="Times New Roman"/>
-                <w:sz w:val="20"/>
-              </w:rPr>
-            </w:r>
-          </w:p>
-        </w:tc>
-        <w:tc>
-          <w:tcPr>
-            <w:tcW w:type="dxa" w:w="1805"/>
-          </w:tcPr>
-          <w:p>
-            <w:r/>
-            <w:r>
-              <w:rPr>
-                <w:rFonts w:ascii="Times New Roman" w:hAnsi="Times New Roman"/>
-                <w:sz w:val="20"/>
-              </w:rPr>
-              <w:t>BLOCKED</w:t>
-            </w:r>
-          </w:p>
-        </w:tc>
-        <w:tc>
-          <w:tcPr>
-            <w:tcW w:type="dxa" w:w="1805"/>
-          </w:tcPr>
-          <w:p>
-            <w:r/>
-            <w:r>
-              <w:rPr>
-                <w:rFonts w:ascii="Times New Roman" w:hAnsi="Times New Roman"/>
-                <w:sz w:val="20"/>
-              </w:rPr>
-              <w:t>—</w:t>
-            </w:r>
-          </w:p>
-        </w:tc>
-      </w:tr>
-      <w:tr>
-        <w:tc>
-          <w:tcPr>
-            <w:tcW w:type="dxa" w:w="1805"/>
-          </w:tcPr>
-          <w:p>
-            <w:r/>
-            <w:r>
-              <w:rPr>
-                <w:rFonts w:ascii="Times New Roman" w:hAnsi="Times New Roman"/>
-                <w:sz w:val="20"/>
-              </w:rPr>
-              <w:t>Retrieval Agent</w:t>
             </w:r>
           </w:p>
         </w:tc>
@@ -5438,156 +5438,6 @@
                 <w:rFonts w:ascii="Times New Roman" w:hAnsi="Times New Roman"/>
                 <w:sz w:val="20"/>
               </w:rPr>
-              <w:t>Extraction Agent</w:t>
-            </w:r>
-          </w:p>
-        </w:tc>
-        <w:tc>
-          <w:tcPr>
-            <w:tcW w:type="dxa" w:w="1805"/>
-          </w:tcPr>
-          <w:p>
-            <w:r/>
-            <w:r>
-              <w:rPr>
-                <w:rFonts w:ascii="Times New Roman" w:hAnsi="Times New Roman"/>
-                <w:sz w:val="20"/>
-              </w:rPr>
-            </w:r>
-          </w:p>
-        </w:tc>
-        <w:tc>
-          <w:tcPr>
-            <w:tcW w:type="dxa" w:w="1805"/>
-          </w:tcPr>
-          <w:p>
-            <w:r/>
-            <w:r>
-              <w:rPr>
-                <w:rFonts w:ascii="Times New Roman" w:hAnsi="Times New Roman"/>
-                <w:sz w:val="20"/>
-              </w:rPr>
-            </w:r>
-          </w:p>
-        </w:tc>
-        <w:tc>
-          <w:tcPr>
-            <w:tcW w:type="dxa" w:w="1805"/>
-          </w:tcPr>
-          <w:p>
-            <w:r/>
-            <w:r>
-              <w:rPr>
-                <w:rFonts w:ascii="Times New Roman" w:hAnsi="Times New Roman"/>
-                <w:sz w:val="20"/>
-              </w:rPr>
-              <w:t>SUCCESS</w:t>
-            </w:r>
-          </w:p>
-        </w:tc>
-        <w:tc>
-          <w:tcPr>
-            <w:tcW w:type="dxa" w:w="1805"/>
-          </w:tcPr>
-          <w:p>
-            <w:r/>
-            <w:r>
-              <w:rPr>
-                <w:rFonts w:ascii="Times New Roman" w:hAnsi="Times New Roman"/>
-                <w:sz w:val="20"/>
-              </w:rPr>
-              <w:t>—</w:t>
-            </w:r>
-          </w:p>
-        </w:tc>
-      </w:tr>
-      <w:tr>
-        <w:tc>
-          <w:tcPr>
-            <w:tcW w:type="dxa" w:w="1805"/>
-          </w:tcPr>
-          <w:p>
-            <w:r/>
-            <w:r>
-              <w:rPr>
-                <w:rFonts w:ascii="Times New Roman" w:hAnsi="Times New Roman"/>
-                <w:sz w:val="20"/>
-              </w:rPr>
-              <w:t>ProcurementAgent</w:t>
-            </w:r>
-          </w:p>
-        </w:tc>
-        <w:tc>
-          <w:tcPr>
-            <w:tcW w:type="dxa" w:w="1805"/>
-          </w:tcPr>
-          <w:p>
-            <w:r/>
-            <w:r>
-              <w:rPr>
-                <w:rFonts w:ascii="Times New Roman" w:hAnsi="Times New Roman"/>
-                <w:sz w:val="20"/>
-              </w:rPr>
-            </w:r>
-          </w:p>
-        </w:tc>
-        <w:tc>
-          <w:tcPr>
-            <w:tcW w:type="dxa" w:w="1805"/>
-          </w:tcPr>
-          <w:p>
-            <w:r/>
-            <w:r>
-              <w:rPr>
-                <w:rFonts w:ascii="Times New Roman" w:hAnsi="Times New Roman"/>
-                <w:sz w:val="20"/>
-              </w:rPr>
-            </w:r>
-          </w:p>
-        </w:tc>
-        <w:tc>
-          <w:tcPr>
-            <w:tcW w:type="dxa" w:w="1805"/>
-          </w:tcPr>
-          <w:p>
-            <w:r/>
-            <w:r>
-              <w:rPr>
-                <w:rFonts w:ascii="Times New Roman" w:hAnsi="Times New Roman"/>
-                <w:sz w:val="20"/>
-              </w:rPr>
-              <w:t>SUCCESS</w:t>
-            </w:r>
-          </w:p>
-        </w:tc>
-        <w:tc>
-          <w:tcPr>
-            <w:tcW w:type="dxa" w:w="1805"/>
-          </w:tcPr>
-          <w:p>
-            <w:r/>
-            <w:r>
-              <w:rPr>
-                <w:rFonts w:ascii="Times New Roman" w:hAnsi="Times New Roman"/>
-                <w:sz w:val="20"/>
-              </w:rPr>
-              <w:t>—</w:t>
-            </w:r>
-          </w:p>
-        </w:tc>
-      </w:tr>
-      <w:tr>
-        <w:tc>
-          <w:tcPr>
-            <w:tcW w:type="dxa" w:w="1805"/>
-          </w:tcPr>
-          <w:p>
-            <w:r/>
-            <w:r>
-              <w:rPr>
-                <w:rFonts w:ascii="Times New Roman" w:hAnsi="Times New Roman"/>
-                <w:sz w:val="20"/>
-              </w:rPr>
               <w:t>ProcurementAgent</w:t>
             </w:r>
           </w:p>
@@ -5738,6 +5588,156 @@
                 <w:rFonts w:ascii="Times New Roman" w:hAnsi="Times New Roman"/>
                 <w:sz w:val="20"/>
               </w:rPr>
+              <w:t>Pin Generator</w:t>
+            </w:r>
+          </w:p>
+        </w:tc>
+        <w:tc>
+          <w:tcPr>
+            <w:tcW w:type="dxa" w:w="1805"/>
+          </w:tcPr>
+          <w:p>
+            <w:r/>
+            <w:r>
+              <w:rPr>
+                <w:rFonts w:ascii="Times New Roman" w:hAnsi="Times New Roman"/>
+                <w:sz w:val="20"/>
+              </w:rPr>
+            </w:r>
+          </w:p>
+        </w:tc>
+        <w:tc>
+          <w:tcPr>
+            <w:tcW w:type="dxa" w:w="1805"/>
+          </w:tcPr>
+          <w:p>
+            <w:r/>
+            <w:r>
+              <w:rPr>
+                <w:rFonts w:ascii="Times New Roman" w:hAnsi="Times New Roman"/>
+                <w:sz w:val="20"/>
+              </w:rPr>
+            </w:r>
+          </w:p>
+        </w:tc>
+        <w:tc>
+          <w:tcPr>
+            <w:tcW w:type="dxa" w:w="1805"/>
+          </w:tcPr>
+          <w:p>
+            <w:r/>
+            <w:r>
+              <w:rPr>
+                <w:rFonts w:ascii="Times New Roman" w:hAnsi="Times New Roman"/>
+                <w:sz w:val="20"/>
+              </w:rPr>
+              <w:t>SUCCESS</w:t>
+            </w:r>
+          </w:p>
+        </w:tc>
+        <w:tc>
+          <w:tcPr>
+            <w:tcW w:type="dxa" w:w="1805"/>
+          </w:tcPr>
+          <w:p>
+            <w:r/>
+            <w:r>
+              <w:rPr>
+                <w:rFonts w:ascii="Times New Roman" w:hAnsi="Times New Roman"/>
+                <w:sz w:val="20"/>
+              </w:rPr>
+              <w:t>—</w:t>
+            </w:r>
+          </w:p>
+        </w:tc>
+      </w:tr>
+      <w:tr>
+        <w:tc>
+          <w:tcPr>
+            <w:tcW w:type="dxa" w:w="1805"/>
+          </w:tcPr>
+          <w:p>
+            <w:r/>
+            <w:r>
+              <w:rPr>
+                <w:rFonts w:ascii="Times New Roman" w:hAnsi="Times New Roman"/>
+                <w:sz w:val="20"/>
+              </w:rPr>
+              <w:t>Extraction Agent</w:t>
+            </w:r>
+          </w:p>
+        </w:tc>
+        <w:tc>
+          <w:tcPr>
+            <w:tcW w:type="dxa" w:w="1805"/>
+          </w:tcPr>
+          <w:p>
+            <w:r/>
+            <w:r>
+              <w:rPr>
+                <w:rFonts w:ascii="Times New Roman" w:hAnsi="Times New Roman"/>
+                <w:sz w:val="20"/>
+              </w:rPr>
+            </w:r>
+          </w:p>
+        </w:tc>
+        <w:tc>
+          <w:tcPr>
+            <w:tcW w:type="dxa" w:w="1805"/>
+          </w:tcPr>
+          <w:p>
+            <w:r/>
+            <w:r>
+              <w:rPr>
+                <w:rFonts w:ascii="Times New Roman" w:hAnsi="Times New Roman"/>
+                <w:sz w:val="20"/>
+              </w:rPr>
+            </w:r>
+          </w:p>
+        </w:tc>
+        <w:tc>
+          <w:tcPr>
+            <w:tcW w:type="dxa" w:w="1805"/>
+          </w:tcPr>
+          <w:p>
+            <w:r/>
+            <w:r>
+              <w:rPr>
+                <w:rFonts w:ascii="Times New Roman" w:hAnsi="Times New Roman"/>
+                <w:sz w:val="20"/>
+              </w:rPr>
+              <w:t>SUCCESS</w:t>
+            </w:r>
+          </w:p>
+        </w:tc>
+        <w:tc>
+          <w:tcPr>
+            <w:tcW w:type="dxa" w:w="1805"/>
+          </w:tcPr>
+          <w:p>
+            <w:r/>
+            <w:r>
+              <w:rPr>
+                <w:rFonts w:ascii="Times New Roman" w:hAnsi="Times New Roman"/>
+                <w:sz w:val="20"/>
+              </w:rPr>
+              <w:t>—</w:t>
+            </w:r>
+          </w:p>
+        </w:tc>
+      </w:tr>
+      <w:tr>
+        <w:tc>
+          <w:tcPr>
+            <w:tcW w:type="dxa" w:w="1805"/>
+          </w:tcPr>
+          <w:p>
+            <w:r/>
+            <w:r>
+              <w:rPr>
+                <w:rFonts w:ascii="Times New Roman" w:hAnsi="Times New Roman"/>
+                <w:sz w:val="20"/>
+              </w:rPr>
               <w:t>Voltage Checker</w:t>
             </w:r>
           </w:p>
@@ -5813,7 +5813,7 @@
                 <w:rFonts w:ascii="Times New Roman" w:hAnsi="Times New Roman"/>
                 <w:sz w:val="20"/>
               </w:rPr>
-              <w:t>Pin Generator</w:t>
+              <w:t>Planner Agent</w:t>
             </w:r>
           </w:p>
         </w:tc>

</xml_diff>